<commit_message>
Update cv_ja.docx: remove header table, add title/dept below name
- ヘッダー表を削除
- 氏名の下に肩書き・研究領域・所属部門（実証経済部門）を追記

https://claude.ai/code/session_01BeaMThBdd5D4FWDMPcdYZd
</commit_message>
<xml_diff>
--- a/cv_ja/cv_ja.docx
+++ b/cv_ja/cv_ja.docx
@@ -2,96 +2,6 @@
 <file path=word/document.xml><?xml version="1.0" encoding="utf-8"?>
 <w:document xmlns:wpc="http://schemas.microsoft.com/office/word/2010/wordprocessingCanvas" xmlns:mo="http://schemas.microsoft.com/office/mac/office/2008/main" xmlns:mc="http://schemas.openxmlformats.org/markup-compatibility/2006" xmlns:mv="urn:schemas-microsoft-com:mac:vml" xmlns:o="urn:schemas-microsoft-com:office:office" xmlns:r="http://schemas.openxmlformats.org/officeDocument/2006/relationships" xmlns:m="http://schemas.openxmlformats.org/officeDocument/2006/math" xmlns:v="urn:schemas-microsoft-com:vml" xmlns:wp14="http://schemas.microsoft.com/office/word/2010/wordprocessingDrawing" xmlns:wp="http://schemas.openxmlformats.org/drawingml/2006/wordprocessingDrawing" xmlns:w10="urn:schemas-microsoft-com:office:word" xmlns:w="http://schemas.openxmlformats.org/wordprocessingml/2006/main" xmlns:w14="http://schemas.microsoft.com/office/word/2010/wordml" xmlns:wpg="http://schemas.microsoft.com/office/word/2010/wordprocessingGroup" xmlns:wpi="http://schemas.microsoft.com/office/word/2010/wordprocessingInk" xmlns:wne="http://schemas.microsoft.com/office/word/2006/wordml" xmlns:wps="http://schemas.microsoft.com/office/word/2010/wordprocessingShape" mc:Ignorable="w14 wp14">
   <w:body>
-    <w:tbl>
-      <w:tblPr>
-        <w:tblStyle w:val="TableGrid"/>
-        <w:tblW w:type="auto" w:w="0"/>
-        <w:jc w:val="left"/>
-        <w:tblLook w:firstColumn="1" w:firstRow="1" w:lastColumn="0" w:lastRow="0" w:noHBand="0" w:noVBand="1" w:val="04A0"/>
-      </w:tblPr>
-      <w:tblGrid>
-        <w:gridCol w:w="4561"/>
-        <w:gridCol w:w="4561"/>
-      </w:tblGrid>
-      <w:tr>
-        <w:tc>
-          <w:tcPr>
-            <w:tcW w:type="dxa" w:w="6803"/>
-          </w:tcPr>
-          <w:p>
-            <w:r>
-              <w:rPr>
-                <w:rFonts w:ascii="Times New Roman" w:hAnsi="Times New Roman" w:eastAsia="游ゴシック"/>
-                <w:b/>
-                <w:sz w:val="24"/>
-              </w:rPr>
-              <w:t>准教授　高橋　悠太　TAKAHASHI, Yuta</w:t>
-            </w:r>
-          </w:p>
-        </w:tc>
-        <w:tc>
-          <w:tcPr>
-            <w:tcW w:type="dxa" w:w="1701"/>
-          </w:tcPr>
-          <w:p>
-            <w:r>
-              <w:t>[写真]</w:t>
-            </w:r>
-          </w:p>
-        </w:tc>
-      </w:tr>
-      <w:tr>
-        <w:tc>
-          <w:tcPr>
-            <w:tcW w:type="dxa" w:w="6803"/>
-          </w:tcPr>
-          <w:p>
-            <w:r>
-              <w:rPr>
-                <w:rFonts w:ascii="Times New Roman" w:hAnsi="Times New Roman" w:eastAsia="游明朝"/>
-                <w:b w:val="0"/>
-                <w:sz w:val="22"/>
-              </w:rPr>
-              <w:t>研究領域：マクロ経済学</w:t>
-            </w:r>
-          </w:p>
-        </w:tc>
-        <w:tc>
-          <w:tcPr>
-            <w:tcW w:type="dxa" w:w="1701"/>
-          </w:tcPr>
-          <w:p>
-            <w:r/>
-          </w:p>
-        </w:tc>
-      </w:tr>
-      <w:tr>
-        <w:tc>
-          <w:tcPr>
-            <w:tcW w:type="dxa" w:w="6803"/>
-          </w:tcPr>
-          <w:p>
-            <w:r>
-              <w:rPr>
-                <w:rFonts w:ascii="Times New Roman" w:hAnsi="Times New Roman" w:eastAsia="游明朝"/>
-                <w:b w:val="0"/>
-                <w:sz w:val="22"/>
-              </w:rPr>
-              <w:t>所属部門：大阪大学 社会経済研究所</w:t>
-            </w:r>
-          </w:p>
-        </w:tc>
-        <w:tc>
-          <w:tcPr>
-            <w:tcW w:type="dxa" w:w="1701"/>
-          </w:tcPr>
-          <w:p>
-            <w:r/>
-          </w:p>
-        </w:tc>
-      </w:tr>
-    </w:tbl>
-    <w:p/>
     <w:p>
       <w:pPr>
         <w:spacing w:before="240" w:after="80"/>
@@ -107,7 +17,7 @@
     </w:p>
     <w:p>
       <w:pPr>
-        <w:spacing w:before="0" w:after="40"/>
+        <w:spacing w:after="40"/>
       </w:pPr>
       <w:r>
         <w:rPr>
@@ -116,6 +26,45 @@
           <w:sz w:val="21"/>
         </w:rPr>
         <w:t>高橋 悠太（たかはし ゆうた / Yuta Takahashi）</w:t>
+      </w:r>
+    </w:p>
+    <w:p>
+      <w:pPr>
+        <w:spacing w:after="20"/>
+      </w:pPr>
+      <w:r>
+        <w:rPr>
+          <w:rFonts w:ascii="Times New Roman" w:hAnsi="Times New Roman" w:eastAsia="游明朝"/>
+          <w:b w:val="0"/>
+          <w:sz w:val="21"/>
+        </w:rPr>
+        <w:t>准教授</w:t>
+      </w:r>
+    </w:p>
+    <w:p>
+      <w:pPr>
+        <w:spacing w:after="20"/>
+      </w:pPr>
+      <w:r>
+        <w:rPr>
+          <w:rFonts w:ascii="Times New Roman" w:hAnsi="Times New Roman" w:eastAsia="游明朝"/>
+          <w:b w:val="0"/>
+          <w:sz w:val="21"/>
+        </w:rPr>
+        <w:t>研究領域：マクロ経済学</w:t>
+      </w:r>
+    </w:p>
+    <w:p>
+      <w:pPr>
+        <w:spacing w:after="20"/>
+      </w:pPr>
+      <w:r>
+        <w:rPr>
+          <w:rFonts w:ascii="Times New Roman" w:hAnsi="Times New Roman" w:eastAsia="游明朝"/>
+          <w:b w:val="0"/>
+          <w:sz w:val="21"/>
+        </w:rPr>
+        <w:t>所属部門：実証経済部門</w:t>
       </w:r>
     </w:p>
     <w:p>

</xml_diff>

<commit_message>
Add 講演・口頭発表等 section to cv_ja.docx (organized by year)
researchmapのデータをもとに2019〜2025年の発表を年毎に整理

https://claude.ai/code/session_01BeaMThBdd5D4FWDMPcdYZd
</commit_message>
<xml_diff>
--- a/cv_ja/cv_ja.docx
+++ b/cv_ja/cv_ja.docx
@@ -486,6 +486,489 @@
         <w:t>Canadian Journal of Economics, Economic Journal, Economic Modelling, Economic Theory, Economics Letters, European Economic Review, Games and Economic Behavior, Hitotsubashi Journal of Economics, International Economic Review, Journal of Applied Economics, Journal of Economic Behavior &amp; Organization, Journal of International Economics, Journal of Macroeconomics, Journal of Political Economy, Journal of the Japanese and International Economies, Quantitative Economics, Review of Economic Dynamics, Review of Economic Studies, 経済研究</w:t>
       </w:r>
     </w:p>
+    <w:p>
+      <w:pPr>
+        <w:spacing w:before="240" w:after="80"/>
+      </w:pPr>
+      <w:r>
+        <w:rPr>
+          <w:rFonts w:ascii="Times New Roman" w:hAnsi="Times New Roman" w:eastAsia="游ゴシック"/>
+          <w:b/>
+          <w:sz w:val="24"/>
+        </w:rPr>
+        <w:t>【講演・口頭発表等】</w:t>
+      </w:r>
+    </w:p>
+    <w:p>
+      <w:pPr>
+        <w:spacing w:before="120" w:after="40"/>
+      </w:pPr>
+      <w:r>
+        <w:rPr>
+          <w:rFonts w:ascii="Times New Roman" w:hAnsi="Times New Roman" w:eastAsia="游明朝"/>
+          <w:b/>
+          <w:sz w:val="21"/>
+        </w:rPr>
+        <w:t>2025年</w:t>
+      </w:r>
+    </w:p>
+    <w:p>
+      <w:pPr>
+        <w:spacing w:after="20"/>
+        <w:ind w:left="283"/>
+      </w:pPr>
+      <w:r>
+        <w:rPr>
+          <w:rFonts w:ascii="Times New Roman" w:hAnsi="Times New Roman" w:eastAsia="游明朝"/>
+          <w:b w:val="0"/>
+          <w:sz w:val="21"/>
+        </w:rPr>
+        <w:t>5月　The 2nd International SPACE Workshop　（招待）</w:t>
+      </w:r>
+    </w:p>
+    <w:p>
+      <w:pPr>
+        <w:spacing w:after="20"/>
+        <w:ind w:left="283"/>
+      </w:pPr>
+      <w:r>
+        <w:rPr>
+          <w:rFonts w:ascii="Times New Roman" w:hAnsi="Times New Roman" w:eastAsia="游明朝"/>
+          <w:b w:val="0"/>
+          <w:sz w:val="21"/>
+        </w:rPr>
+        <w:t>5月　財務総合政策研究所セミナー　（招待）</w:t>
+      </w:r>
+    </w:p>
+    <w:p>
+      <w:pPr>
+        <w:spacing w:after="20"/>
+        <w:ind w:left="283"/>
+      </w:pPr>
+      <w:r>
+        <w:rPr>
+          <w:rFonts w:ascii="Times New Roman" w:hAnsi="Times New Roman" w:eastAsia="游明朝"/>
+          <w:b w:val="0"/>
+          <w:sz w:val="21"/>
+        </w:rPr>
+        <w:t>8月　SWET 2025 (Macroeconomics, Financial Economics Session)</w:t>
+      </w:r>
+    </w:p>
+    <w:p>
+      <w:pPr>
+        <w:spacing w:after="20"/>
+        <w:ind w:left="283"/>
+      </w:pPr>
+      <w:r>
+        <w:rPr>
+          <w:rFonts w:ascii="Times New Roman" w:hAnsi="Times New Roman" w:eastAsia="游明朝"/>
+          <w:b w:val="0"/>
+          <w:sz w:val="21"/>
+        </w:rPr>
+        <w:t>8月　2025 World Congress of the Econometric Society</w:t>
+      </w:r>
+    </w:p>
+    <w:p>
+      <w:pPr>
+        <w:spacing w:after="20"/>
+        <w:ind w:left="283"/>
+      </w:pPr>
+      <w:r>
+        <w:rPr>
+          <w:rFonts w:ascii="Times New Roman" w:hAnsi="Times New Roman" w:eastAsia="游明朝"/>
+          <w:b w:val="0"/>
+          <w:sz w:val="21"/>
+        </w:rPr>
+        <w:t>9月　The 1st Workshop of the East and South-East Asian Macroeconomic Society</w:t>
+      </w:r>
+    </w:p>
+    <w:p>
+      <w:pPr>
+        <w:spacing w:after="20"/>
+        <w:ind w:left="283"/>
+      </w:pPr>
+      <w:r>
+        <w:rPr>
+          <w:rFonts w:ascii="Times New Roman" w:hAnsi="Times New Roman" w:eastAsia="游明朝"/>
+          <w:b w:val="0"/>
+          <w:sz w:val="21"/>
+        </w:rPr>
+        <w:t>10月　International Workshop on Experiments in Macroeconomics and Finance　（招待）</w:t>
+      </w:r>
+    </w:p>
+    <w:p>
+      <w:pPr>
+        <w:spacing w:after="20"/>
+        <w:ind w:left="283"/>
+      </w:pPr>
+      <w:r>
+        <w:rPr>
+          <w:rFonts w:ascii="Times New Roman" w:hAnsi="Times New Roman" w:eastAsia="游明朝"/>
+          <w:b w:val="0"/>
+          <w:sz w:val="21"/>
+        </w:rPr>
+        <w:t>11月　WAMS 2025</w:t>
+      </w:r>
+    </w:p>
+    <w:p>
+      <w:pPr>
+        <w:spacing w:after="20"/>
+        <w:ind w:left="283"/>
+      </w:pPr>
+      <w:r>
+        <w:rPr>
+          <w:rFonts w:ascii="Times New Roman" w:hAnsi="Times New Roman" w:eastAsia="游明朝"/>
+          <w:b w:val="0"/>
+          <w:sz w:val="21"/>
+        </w:rPr>
+        <w:t>12月　OzMac 2025</w:t>
+      </w:r>
+    </w:p>
+    <w:p>
+      <w:pPr>
+        <w:spacing w:before="120" w:after="40"/>
+      </w:pPr>
+      <w:r>
+        <w:rPr>
+          <w:rFonts w:ascii="Times New Roman" w:hAnsi="Times New Roman" w:eastAsia="游明朝"/>
+          <w:b/>
+          <w:sz w:val="21"/>
+        </w:rPr>
+        <w:t>2024年</w:t>
+      </w:r>
+    </w:p>
+    <w:p>
+      <w:pPr>
+        <w:spacing w:after="20"/>
+        <w:ind w:left="283"/>
+      </w:pPr>
+      <w:r>
+        <w:rPr>
+          <w:rFonts w:ascii="Times New Roman" w:hAnsi="Times New Roman" w:eastAsia="游明朝"/>
+          <w:b w:val="0"/>
+          <w:sz w:val="21"/>
+        </w:rPr>
+        <w:t>3月　HSI2023-The 9th Hitotsubashi Summer Institute</w:t>
+      </w:r>
+    </w:p>
+    <w:p>
+      <w:pPr>
+        <w:spacing w:after="20"/>
+        <w:ind w:left="283"/>
+      </w:pPr>
+      <w:r>
+        <w:rPr>
+          <w:rFonts w:ascii="Times New Roman" w:hAnsi="Times New Roman" w:eastAsia="游明朝"/>
+          <w:b w:val="0"/>
+          <w:sz w:val="21"/>
+        </w:rPr>
+        <w:t>3月　ANU-AJRC, Hitotsubashi, Keio and University of Tokyo Conference on Frontiers in Macroeconomics</w:t>
+      </w:r>
+    </w:p>
+    <w:p>
+      <w:pPr>
+        <w:spacing w:before="120" w:after="40"/>
+      </w:pPr>
+      <w:r>
+        <w:rPr>
+          <w:rFonts w:ascii="Times New Roman" w:hAnsi="Times New Roman" w:eastAsia="游明朝"/>
+          <w:b/>
+          <w:sz w:val="21"/>
+        </w:rPr>
+        <w:t>2023年</w:t>
+      </w:r>
+    </w:p>
+    <w:p>
+      <w:pPr>
+        <w:spacing w:after="20"/>
+        <w:ind w:left="283"/>
+      </w:pPr>
+      <w:r>
+        <w:rPr>
+          <w:rFonts w:ascii="Times New Roman" w:hAnsi="Times New Roman" w:eastAsia="游明朝"/>
+          <w:b w:val="0"/>
+          <w:sz w:val="21"/>
+        </w:rPr>
+        <w:t>7月　2023 Asian Meeting of the Econometric Society in East and Southeast Asia (AMES)</w:t>
+      </w:r>
+    </w:p>
+    <w:p>
+      <w:pPr>
+        <w:spacing w:after="20"/>
+        <w:ind w:left="283"/>
+      </w:pPr>
+      <w:r>
+        <w:rPr>
+          <w:rFonts w:ascii="Times New Roman" w:hAnsi="Times New Roman" w:eastAsia="游明朝"/>
+          <w:b w:val="0"/>
+          <w:sz w:val="21"/>
+        </w:rPr>
+        <w:t>9月　日本経済学会 2023 年度秋季大会　（招待）</w:t>
+      </w:r>
+    </w:p>
+    <w:p>
+      <w:pPr>
+        <w:spacing w:after="20"/>
+        <w:ind w:left="283"/>
+      </w:pPr>
+      <w:r>
+        <w:rPr>
+          <w:rFonts w:ascii="Times New Roman" w:hAnsi="Times New Roman" w:eastAsia="游明朝"/>
+          <w:b w:val="0"/>
+          <w:sz w:val="21"/>
+        </w:rPr>
+        <w:t>12月　European Winter Meeting of the Econometric Society 2023</w:t>
+      </w:r>
+    </w:p>
+    <w:p>
+      <w:pPr>
+        <w:spacing w:before="120" w:after="40"/>
+      </w:pPr>
+      <w:r>
+        <w:rPr>
+          <w:rFonts w:ascii="Times New Roman" w:hAnsi="Times New Roman" w:eastAsia="游明朝"/>
+          <w:b/>
+          <w:sz w:val="21"/>
+        </w:rPr>
+        <w:t>2021年</w:t>
+      </w:r>
+    </w:p>
+    <w:p>
+      <w:pPr>
+        <w:spacing w:after="20"/>
+        <w:ind w:left="283"/>
+      </w:pPr>
+      <w:r>
+        <w:rPr>
+          <w:rFonts w:ascii="Times New Roman" w:hAnsi="Times New Roman" w:eastAsia="游明朝"/>
+          <w:b w:val="0"/>
+          <w:sz w:val="21"/>
+        </w:rPr>
+        <w:t>1月　マクロ経済学ワークショップ（一橋大学）</w:t>
+      </w:r>
+    </w:p>
+    <w:p>
+      <w:pPr>
+        <w:spacing w:after="20"/>
+        <w:ind w:left="283"/>
+      </w:pPr>
+      <w:r>
+        <w:rPr>
+          <w:rFonts w:ascii="Times New Roman" w:hAnsi="Times New Roman" w:eastAsia="游明朝"/>
+          <w:b w:val="0"/>
+          <w:sz w:val="21"/>
+        </w:rPr>
+        <w:t>4月　マクロ経済学ワークショップ 2021（東京大学 CIRJE）</w:t>
+      </w:r>
+    </w:p>
+    <w:p>
+      <w:pPr>
+        <w:spacing w:after="20"/>
+        <w:ind w:left="283"/>
+      </w:pPr>
+      <w:r>
+        <w:rPr>
+          <w:rFonts w:ascii="Times New Roman" w:hAnsi="Times New Roman" w:eastAsia="游明朝"/>
+          <w:b w:val="0"/>
+          <w:sz w:val="21"/>
+        </w:rPr>
+        <w:t>4月　マクロ金融ワークショップ（一橋大学）</w:t>
+      </w:r>
+    </w:p>
+    <w:p>
+      <w:pPr>
+        <w:spacing w:after="20"/>
+        <w:ind w:left="283"/>
+      </w:pPr>
+      <w:r>
+        <w:rPr>
+          <w:rFonts w:ascii="Times New Roman" w:hAnsi="Times New Roman" w:eastAsia="游明朝"/>
+          <w:b w:val="0"/>
+          <w:sz w:val="21"/>
+        </w:rPr>
+        <w:t>5月　第1回マクロ税制セミナー（学習院大学）</w:t>
+      </w:r>
+    </w:p>
+    <w:p>
+      <w:pPr>
+        <w:spacing w:after="20"/>
+        <w:ind w:left="283"/>
+      </w:pPr>
+      <w:r>
+        <w:rPr>
+          <w:rFonts w:ascii="Times New Roman" w:hAnsi="Times New Roman" w:eastAsia="游明朝"/>
+          <w:b w:val="0"/>
+          <w:sz w:val="21"/>
+        </w:rPr>
+        <w:t>6月　早稲田大学セミナー</w:t>
+      </w:r>
+    </w:p>
+    <w:p>
+      <w:pPr>
+        <w:spacing w:after="20"/>
+        <w:ind w:left="283"/>
+      </w:pPr>
+      <w:r>
+        <w:rPr>
+          <w:rFonts w:ascii="Times New Roman" w:hAnsi="Times New Roman" w:eastAsia="游明朝"/>
+          <w:b w:val="0"/>
+          <w:sz w:val="21"/>
+        </w:rPr>
+        <w:t>6月　マクロ経済学ワークショップ（慶應大学）</w:t>
+      </w:r>
+    </w:p>
+    <w:p>
+      <w:pPr>
+        <w:spacing w:after="20"/>
+        <w:ind w:left="283"/>
+      </w:pPr>
+      <w:r>
+        <w:rPr>
+          <w:rFonts w:ascii="Times New Roman" w:hAnsi="Times New Roman" w:eastAsia="游明朝"/>
+          <w:b w:val="0"/>
+          <w:sz w:val="21"/>
+        </w:rPr>
+        <w:t>7月　SED</w:t>
+      </w:r>
+    </w:p>
+    <w:p>
+      <w:pPr>
+        <w:spacing w:after="20"/>
+        <w:ind w:left="283"/>
+      </w:pPr>
+      <w:r>
+        <w:rPr>
+          <w:rFonts w:ascii="Times New Roman" w:hAnsi="Times New Roman" w:eastAsia="游明朝"/>
+          <w:b w:val="0"/>
+          <w:sz w:val="21"/>
+        </w:rPr>
+        <w:t>7月　六甲フォーラム（神戸大学）</w:t>
+      </w:r>
+    </w:p>
+    <w:p>
+      <w:pPr>
+        <w:spacing w:after="20"/>
+        <w:ind w:left="283"/>
+      </w:pPr>
+      <w:r>
+        <w:rPr>
+          <w:rFonts w:ascii="Times New Roman" w:hAnsi="Times New Roman" w:eastAsia="游明朝"/>
+          <w:b w:val="0"/>
+          <w:sz w:val="21"/>
+        </w:rPr>
+        <w:t>9月　GSE-OSIPP-ISER Joint Conference in Economics（大阪大学）</w:t>
+      </w:r>
+    </w:p>
+    <w:p>
+      <w:pPr>
+        <w:spacing w:after="20"/>
+        <w:ind w:left="283"/>
+      </w:pPr>
+      <w:r>
+        <w:rPr>
+          <w:rFonts w:ascii="Times New Roman" w:hAnsi="Times New Roman" w:eastAsia="游明朝"/>
+          <w:b w:val="0"/>
+          <w:sz w:val="21"/>
+        </w:rPr>
+        <w:t>12月　7th Annual CIGS End of Year Macroeconomics Conference</w:t>
+      </w:r>
+    </w:p>
+    <w:p>
+      <w:pPr>
+        <w:spacing w:before="120" w:after="40"/>
+      </w:pPr>
+      <w:r>
+        <w:rPr>
+          <w:rFonts w:ascii="Times New Roman" w:hAnsi="Times New Roman" w:eastAsia="游明朝"/>
+          <w:b/>
+          <w:sz w:val="21"/>
+        </w:rPr>
+        <w:t>2020年</w:t>
+      </w:r>
+    </w:p>
+    <w:p>
+      <w:pPr>
+        <w:spacing w:after="20"/>
+        <w:ind w:left="283"/>
+      </w:pPr>
+      <w:r>
+        <w:rPr>
+          <w:rFonts w:ascii="Times New Roman" w:hAnsi="Times New Roman" w:eastAsia="游明朝"/>
+          <w:b w:val="0"/>
+          <w:sz w:val="21"/>
+        </w:rPr>
+        <w:t>1月　東北大学現代経済学研究会</w:t>
+      </w:r>
+    </w:p>
+    <w:p>
+      <w:pPr>
+        <w:spacing w:after="20"/>
+        <w:ind w:left="283"/>
+      </w:pPr>
+      <w:r>
+        <w:rPr>
+          <w:rFonts w:ascii="Times New Roman" w:hAnsi="Times New Roman" w:eastAsia="游明朝"/>
+          <w:b w:val="0"/>
+          <w:sz w:val="21"/>
+        </w:rPr>
+        <w:t>9月　経済成長と構造変化に関する長期分析研究会</w:t>
+      </w:r>
+    </w:p>
+    <w:p>
+      <w:pPr>
+        <w:spacing w:after="20"/>
+        <w:ind w:left="283"/>
+      </w:pPr>
+      <w:r>
+        <w:rPr>
+          <w:rFonts w:ascii="Times New Roman" w:hAnsi="Times New Roman" w:eastAsia="游明朝"/>
+          <w:b w:val="0"/>
+          <w:sz w:val="21"/>
+        </w:rPr>
+        <w:t>10月　ISER Virtual Workshop in Macro/International Economics</w:t>
+      </w:r>
+    </w:p>
+    <w:p>
+      <w:pPr>
+        <w:spacing w:before="120" w:after="40"/>
+      </w:pPr>
+      <w:r>
+        <w:rPr>
+          <w:rFonts w:ascii="Times New Roman" w:hAnsi="Times New Roman" w:eastAsia="游明朝"/>
+          <w:b/>
+          <w:sz w:val="21"/>
+        </w:rPr>
+        <w:t>2019年</w:t>
+      </w:r>
+    </w:p>
+    <w:p>
+      <w:pPr>
+        <w:spacing w:after="20"/>
+        <w:ind w:left="283"/>
+      </w:pPr>
+      <w:r>
+        <w:rPr>
+          <w:rFonts w:ascii="Times New Roman" w:hAnsi="Times New Roman" w:eastAsia="游明朝"/>
+          <w:b w:val="0"/>
+          <w:sz w:val="21"/>
+        </w:rPr>
+        <w:t>5月　CIGS Conference on Macroeconomic Theory and Policy 2019</w:t>
+      </w:r>
+    </w:p>
+    <w:p>
+      <w:pPr>
+        <w:spacing w:after="20"/>
+        <w:ind w:left="283"/>
+      </w:pPr>
+      <w:r>
+        <w:rPr>
+          <w:rFonts w:ascii="Times New Roman" w:hAnsi="Times New Roman" w:eastAsia="游明朝"/>
+          <w:b w:val="0"/>
+          <w:sz w:val="21"/>
+        </w:rPr>
+        <w:t>9月　Monetary Policy Workshop</w:t>
+      </w:r>
+    </w:p>
     <w:sectPr>
       <w:pgSz w:w="12240" w:h="15840"/>
       <w:pgMar w:top="1417" w:right="1417" w:bottom="1417" w:left="1701" w:header="720" w:footer="720" w:gutter="0"/>

</xml_diff>

<commit_message>
Simplify presentations: list venues by year only, no month/invite info
https://claude.ai/code/session_01BeaMThBdd5D4FWDMPcdYZd
</commit_message>
<xml_diff>
--- a/cv_ja/cv_ja.docx
+++ b/cv_ja/cv_ja.docx
@@ -523,7 +523,7 @@
           <w:b w:val="0"/>
           <w:sz w:val="21"/>
         </w:rPr>
-        <w:t>5月　The 2nd International SPACE Workshop　（招待）</w:t>
+        <w:t>The 2nd International SPACE Workshop</w:t>
       </w:r>
     </w:p>
     <w:p>
@@ -537,7 +537,7 @@
           <w:b w:val="0"/>
           <w:sz w:val="21"/>
         </w:rPr>
-        <w:t>5月　財務総合政策研究所セミナー　（招待）</w:t>
+        <w:t>財務総合政策研究所セミナー</w:t>
       </w:r>
     </w:p>
     <w:p>
@@ -551,7 +551,7 @@
           <w:b w:val="0"/>
           <w:sz w:val="21"/>
         </w:rPr>
-        <w:t>8月　SWET 2025 (Macroeconomics, Financial Economics Session)</w:t>
+        <w:t>SWET 2025 (Macroeconomics, Financial Economics Session)</w:t>
       </w:r>
     </w:p>
     <w:p>
@@ -565,7 +565,7 @@
           <w:b w:val="0"/>
           <w:sz w:val="21"/>
         </w:rPr>
-        <w:t>8月　2025 World Congress of the Econometric Society</w:t>
+        <w:t>2025 World Congress of the Econometric Society</w:t>
       </w:r>
     </w:p>
     <w:p>
@@ -579,7 +579,7 @@
           <w:b w:val="0"/>
           <w:sz w:val="21"/>
         </w:rPr>
-        <w:t>9月　The 1st Workshop of the East and South-East Asian Macroeconomic Society</w:t>
+        <w:t>The 1st Workshop of the East and South-East Asian Macroeconomic Society</w:t>
       </w:r>
     </w:p>
     <w:p>
@@ -593,7 +593,7 @@
           <w:b w:val="0"/>
           <w:sz w:val="21"/>
         </w:rPr>
-        <w:t>10月　International Workshop on Experiments in Macroeconomics and Finance　（招待）</w:t>
+        <w:t>International Workshop on Experiments in Macroeconomics and Finance</w:t>
       </w:r>
     </w:p>
     <w:p>
@@ -607,7 +607,7 @@
           <w:b w:val="0"/>
           <w:sz w:val="21"/>
         </w:rPr>
-        <w:t>11月　WAMS 2025</w:t>
+        <w:t>WAMS 2025</w:t>
       </w:r>
     </w:p>
     <w:p>
@@ -621,7 +621,7 @@
           <w:b w:val="0"/>
           <w:sz w:val="21"/>
         </w:rPr>
-        <w:t>12月　OzMac 2025</w:t>
+        <w:t>OzMac 2025</w:t>
       </w:r>
     </w:p>
     <w:p>
@@ -648,7 +648,7 @@
           <w:b w:val="0"/>
           <w:sz w:val="21"/>
         </w:rPr>
-        <w:t>3月　HSI2023-The 9th Hitotsubashi Summer Institute</w:t>
+        <w:t>HSI2023-The 9th Hitotsubashi Summer Institute</w:t>
       </w:r>
     </w:p>
     <w:p>
@@ -662,7 +662,7 @@
           <w:b w:val="0"/>
           <w:sz w:val="21"/>
         </w:rPr>
-        <w:t>3月　ANU-AJRC, Hitotsubashi, Keio and University of Tokyo Conference on Frontiers in Macroeconomics</w:t>
+        <w:t>ANU-AJRC, Hitotsubashi, Keio and University of Tokyo Conference on Frontiers in Macroeconomics</w:t>
       </w:r>
     </w:p>
     <w:p>
@@ -689,7 +689,7 @@
           <w:b w:val="0"/>
           <w:sz w:val="21"/>
         </w:rPr>
-        <w:t>7月　2023 Asian Meeting of the Econometric Society in East and Southeast Asia (AMES)</w:t>
+        <w:t>2023 Asian Meeting of the Econometric Society in East and Southeast Asia (AMES)</w:t>
       </w:r>
     </w:p>
     <w:p>
@@ -703,7 +703,7 @@
           <w:b w:val="0"/>
           <w:sz w:val="21"/>
         </w:rPr>
-        <w:t>9月　日本経済学会 2023 年度秋季大会　（招待）</w:t>
+        <w:t>日本経済学会 2023 年度秋季大会</w:t>
       </w:r>
     </w:p>
     <w:p>
@@ -717,7 +717,7 @@
           <w:b w:val="0"/>
           <w:sz w:val="21"/>
         </w:rPr>
-        <w:t>12月　European Winter Meeting of the Econometric Society 2023</w:t>
+        <w:t>European Winter Meeting of the Econometric Society 2023</w:t>
       </w:r>
     </w:p>
     <w:p>
@@ -744,7 +744,7 @@
           <w:b w:val="0"/>
           <w:sz w:val="21"/>
         </w:rPr>
-        <w:t>1月　マクロ経済学ワークショップ（一橋大学）</w:t>
+        <w:t>マクロ経済学ワークショップ（一橋大学）</w:t>
       </w:r>
     </w:p>
     <w:p>
@@ -758,7 +758,7 @@
           <w:b w:val="0"/>
           <w:sz w:val="21"/>
         </w:rPr>
-        <w:t>4月　マクロ経済学ワークショップ 2021（東京大学 CIRJE）</w:t>
+        <w:t>マクロ経済学ワークショップ 2021（東京大学 CIRJE）</w:t>
       </w:r>
     </w:p>
     <w:p>
@@ -772,7 +772,7 @@
           <w:b w:val="0"/>
           <w:sz w:val="21"/>
         </w:rPr>
-        <w:t>4月　マクロ金融ワークショップ（一橋大学）</w:t>
+        <w:t>マクロ金融ワークショップ（一橋大学）</w:t>
       </w:r>
     </w:p>
     <w:p>
@@ -786,7 +786,7 @@
           <w:b w:val="0"/>
           <w:sz w:val="21"/>
         </w:rPr>
-        <w:t>5月　第1回マクロ税制セミナー（学習院大学）</w:t>
+        <w:t>第1回マクロ税制セミナー（学習院大学）</w:t>
       </w:r>
     </w:p>
     <w:p>
@@ -800,7 +800,7 @@
           <w:b w:val="0"/>
           <w:sz w:val="21"/>
         </w:rPr>
-        <w:t>6月　早稲田大学セミナー</w:t>
+        <w:t>早稲田大学セミナー</w:t>
       </w:r>
     </w:p>
     <w:p>
@@ -814,7 +814,7 @@
           <w:b w:val="0"/>
           <w:sz w:val="21"/>
         </w:rPr>
-        <w:t>6月　マクロ経済学ワークショップ（慶應大学）</w:t>
+        <w:t>マクロ経済学ワークショップ（慶應大学）</w:t>
       </w:r>
     </w:p>
     <w:p>
@@ -828,7 +828,7 @@
           <w:b w:val="0"/>
           <w:sz w:val="21"/>
         </w:rPr>
-        <w:t>7月　SED</w:t>
+        <w:t>SED</w:t>
       </w:r>
     </w:p>
     <w:p>
@@ -842,7 +842,7 @@
           <w:b w:val="0"/>
           <w:sz w:val="21"/>
         </w:rPr>
-        <w:t>7月　六甲フォーラム（神戸大学）</w:t>
+        <w:t>六甲フォーラム（神戸大学）</w:t>
       </w:r>
     </w:p>
     <w:p>
@@ -856,7 +856,7 @@
           <w:b w:val="0"/>
           <w:sz w:val="21"/>
         </w:rPr>
-        <w:t>9月　GSE-OSIPP-ISER Joint Conference in Economics（大阪大学）</w:t>
+        <w:t>GSE-OSIPP-ISER Joint Conference in Economics（大阪大学）</w:t>
       </w:r>
     </w:p>
     <w:p>
@@ -870,7 +870,7 @@
           <w:b w:val="0"/>
           <w:sz w:val="21"/>
         </w:rPr>
-        <w:t>12月　7th Annual CIGS End of Year Macroeconomics Conference</w:t>
+        <w:t>7th Annual CIGS End of Year Macroeconomics Conference</w:t>
       </w:r>
     </w:p>
     <w:p>
@@ -897,7 +897,7 @@
           <w:b w:val="0"/>
           <w:sz w:val="21"/>
         </w:rPr>
-        <w:t>1月　東北大学現代経済学研究会</w:t>
+        <w:t>東北大学現代経済学研究会</w:t>
       </w:r>
     </w:p>
     <w:p>
@@ -911,7 +911,7 @@
           <w:b w:val="0"/>
           <w:sz w:val="21"/>
         </w:rPr>
-        <w:t>9月　経済成長と構造変化に関する長期分析研究会</w:t>
+        <w:t>経済成長と構造変化に関する長期分析研究会</w:t>
       </w:r>
     </w:p>
     <w:p>
@@ -925,7 +925,7 @@
           <w:b w:val="0"/>
           <w:sz w:val="21"/>
         </w:rPr>
-        <w:t>10月　ISER Virtual Workshop in Macro/International Economics</w:t>
+        <w:t>ISER Virtual Workshop in Macro/International Economics</w:t>
       </w:r>
     </w:p>
     <w:p>
@@ -952,7 +952,7 @@
           <w:b w:val="0"/>
           <w:sz w:val="21"/>
         </w:rPr>
-        <w:t>5月　CIGS Conference on Macroeconomic Theory and Policy 2019</w:t>
+        <w:t>CIGS Conference on Macroeconomic Theory and Policy 2019</w:t>
       </w:r>
     </w:p>
     <w:p>
@@ -966,7 +966,7 @@
           <w:b w:val="0"/>
           <w:sz w:val="21"/>
         </w:rPr>
-        <w:t>9月　Monetary Policy Workshop</w:t>
+        <w:t>Monetary Policy Workshop</w:t>
       </w:r>
     </w:p>
     <w:sectPr>

</xml_diff>

<commit_message>
Format presentations as comma-separated list per year
https://claude.ai/code/session_01BeaMThBdd5D4FWDMPcdYZd
</commit_message>
<xml_diff>
--- a/cv_ja/cv_ja.docx
+++ b/cv_ja/cv_ja.docx
@@ -514,7 +514,7 @@
     </w:p>
     <w:p>
       <w:pPr>
-        <w:spacing w:after="20"/>
+        <w:spacing w:after="40"/>
         <w:ind w:left="283"/>
       </w:pPr>
       <w:r>
@@ -523,105 +523,7 @@
           <w:b w:val="0"/>
           <w:sz w:val="21"/>
         </w:rPr>
-        <w:t>The 2nd International SPACE Workshop</w:t>
-      </w:r>
-    </w:p>
-    <w:p>
-      <w:pPr>
-        <w:spacing w:after="20"/>
-        <w:ind w:left="283"/>
-      </w:pPr>
-      <w:r>
-        <w:rPr>
-          <w:rFonts w:ascii="Times New Roman" w:hAnsi="Times New Roman" w:eastAsia="游明朝"/>
-          <w:b w:val="0"/>
-          <w:sz w:val="21"/>
-        </w:rPr>
-        <w:t>財務総合政策研究所セミナー</w:t>
-      </w:r>
-    </w:p>
-    <w:p>
-      <w:pPr>
-        <w:spacing w:after="20"/>
-        <w:ind w:left="283"/>
-      </w:pPr>
-      <w:r>
-        <w:rPr>
-          <w:rFonts w:ascii="Times New Roman" w:hAnsi="Times New Roman" w:eastAsia="游明朝"/>
-          <w:b w:val="0"/>
-          <w:sz w:val="21"/>
-        </w:rPr>
-        <w:t>SWET 2025 (Macroeconomics, Financial Economics Session)</w:t>
-      </w:r>
-    </w:p>
-    <w:p>
-      <w:pPr>
-        <w:spacing w:after="20"/>
-        <w:ind w:left="283"/>
-      </w:pPr>
-      <w:r>
-        <w:rPr>
-          <w:rFonts w:ascii="Times New Roman" w:hAnsi="Times New Roman" w:eastAsia="游明朝"/>
-          <w:b w:val="0"/>
-          <w:sz w:val="21"/>
-        </w:rPr>
-        <w:t>2025 World Congress of the Econometric Society</w:t>
-      </w:r>
-    </w:p>
-    <w:p>
-      <w:pPr>
-        <w:spacing w:after="20"/>
-        <w:ind w:left="283"/>
-      </w:pPr>
-      <w:r>
-        <w:rPr>
-          <w:rFonts w:ascii="Times New Roman" w:hAnsi="Times New Roman" w:eastAsia="游明朝"/>
-          <w:b w:val="0"/>
-          <w:sz w:val="21"/>
-        </w:rPr>
-        <w:t>The 1st Workshop of the East and South-East Asian Macroeconomic Society</w:t>
-      </w:r>
-    </w:p>
-    <w:p>
-      <w:pPr>
-        <w:spacing w:after="20"/>
-        <w:ind w:left="283"/>
-      </w:pPr>
-      <w:r>
-        <w:rPr>
-          <w:rFonts w:ascii="Times New Roman" w:hAnsi="Times New Roman" w:eastAsia="游明朝"/>
-          <w:b w:val="0"/>
-          <w:sz w:val="21"/>
-        </w:rPr>
-        <w:t>International Workshop on Experiments in Macroeconomics and Finance</w:t>
-      </w:r>
-    </w:p>
-    <w:p>
-      <w:pPr>
-        <w:spacing w:after="20"/>
-        <w:ind w:left="283"/>
-      </w:pPr>
-      <w:r>
-        <w:rPr>
-          <w:rFonts w:ascii="Times New Roman" w:hAnsi="Times New Roman" w:eastAsia="游明朝"/>
-          <w:b w:val="0"/>
-          <w:sz w:val="21"/>
-        </w:rPr>
-        <w:t>WAMS 2025</w:t>
-      </w:r>
-    </w:p>
-    <w:p>
-      <w:pPr>
-        <w:spacing w:after="20"/>
-        <w:ind w:left="283"/>
-      </w:pPr>
-      <w:r>
-        <w:rPr>
-          <w:rFonts w:ascii="Times New Roman" w:hAnsi="Times New Roman" w:eastAsia="游明朝"/>
-          <w:b w:val="0"/>
-          <w:sz w:val="21"/>
-        </w:rPr>
-        <w:t>OzMac 2025</w:t>
+        <w:t>The 2nd International SPACE Workshop, 財務総合政策研究所セミナー, SWET 2025 (Macroeconomics, Financial Economics Session), 2025 World Congress of the Econometric Society, The 1st Workshop of the East and South-East Asian Macroeconomic Society, International Workshop on Experiments in Macroeconomics and Finance, WAMS 2025, OzMac 2025</w:t>
       </w:r>
     </w:p>
     <w:p>
@@ -639,7 +541,7 @@
     </w:p>
     <w:p>
       <w:pPr>
-        <w:spacing w:after="20"/>
+        <w:spacing w:after="40"/>
         <w:ind w:left="283"/>
       </w:pPr>
       <w:r>
@@ -648,21 +550,7 @@
           <w:b w:val="0"/>
           <w:sz w:val="21"/>
         </w:rPr>
-        <w:t>HSI2023-The 9th Hitotsubashi Summer Institute</w:t>
-      </w:r>
-    </w:p>
-    <w:p>
-      <w:pPr>
-        <w:spacing w:after="20"/>
-        <w:ind w:left="283"/>
-      </w:pPr>
-      <w:r>
-        <w:rPr>
-          <w:rFonts w:ascii="Times New Roman" w:hAnsi="Times New Roman" w:eastAsia="游明朝"/>
-          <w:b w:val="0"/>
-          <w:sz w:val="21"/>
-        </w:rPr>
-        <w:t>ANU-AJRC, Hitotsubashi, Keio and University of Tokyo Conference on Frontiers in Macroeconomics</w:t>
+        <w:t>HSI2023-The 9th Hitotsubashi Summer Institute, ANU-AJRC, Hitotsubashi, Keio and University of Tokyo Conference on Frontiers in Macroeconomics</w:t>
       </w:r>
     </w:p>
     <w:p>
@@ -680,7 +568,7 @@
     </w:p>
     <w:p>
       <w:pPr>
-        <w:spacing w:after="20"/>
+        <w:spacing w:after="40"/>
         <w:ind w:left="283"/>
       </w:pPr>
       <w:r>
@@ -689,35 +577,7 @@
           <w:b w:val="0"/>
           <w:sz w:val="21"/>
         </w:rPr>
-        <w:t>2023 Asian Meeting of the Econometric Society in East and Southeast Asia (AMES)</w:t>
-      </w:r>
-    </w:p>
-    <w:p>
-      <w:pPr>
-        <w:spacing w:after="20"/>
-        <w:ind w:left="283"/>
-      </w:pPr>
-      <w:r>
-        <w:rPr>
-          <w:rFonts w:ascii="Times New Roman" w:hAnsi="Times New Roman" w:eastAsia="游明朝"/>
-          <w:b w:val="0"/>
-          <w:sz w:val="21"/>
-        </w:rPr>
-        <w:t>日本経済学会 2023 年度秋季大会</w:t>
-      </w:r>
-    </w:p>
-    <w:p>
-      <w:pPr>
-        <w:spacing w:after="20"/>
-        <w:ind w:left="283"/>
-      </w:pPr>
-      <w:r>
-        <w:rPr>
-          <w:rFonts w:ascii="Times New Roman" w:hAnsi="Times New Roman" w:eastAsia="游明朝"/>
-          <w:b w:val="0"/>
-          <w:sz w:val="21"/>
-        </w:rPr>
-        <w:t>European Winter Meeting of the Econometric Society 2023</w:t>
+        <w:t>2023 Asian Meeting of the Econometric Society in East and Southeast Asia (AMES), 日本経済学会 2023 年度秋季大会, European Winter Meeting of the Econometric Society 2023</w:t>
       </w:r>
     </w:p>
     <w:p>
@@ -735,7 +595,7 @@
     </w:p>
     <w:p>
       <w:pPr>
-        <w:spacing w:after="20"/>
+        <w:spacing w:after="40"/>
         <w:ind w:left="283"/>
       </w:pPr>
       <w:r>
@@ -744,133 +604,7 @@
           <w:b w:val="0"/>
           <w:sz w:val="21"/>
         </w:rPr>
-        <w:t>マクロ経済学ワークショップ（一橋大学）</w:t>
-      </w:r>
-    </w:p>
-    <w:p>
-      <w:pPr>
-        <w:spacing w:after="20"/>
-        <w:ind w:left="283"/>
-      </w:pPr>
-      <w:r>
-        <w:rPr>
-          <w:rFonts w:ascii="Times New Roman" w:hAnsi="Times New Roman" w:eastAsia="游明朝"/>
-          <w:b w:val="0"/>
-          <w:sz w:val="21"/>
-        </w:rPr>
-        <w:t>マクロ経済学ワークショップ 2021（東京大学 CIRJE）</w:t>
-      </w:r>
-    </w:p>
-    <w:p>
-      <w:pPr>
-        <w:spacing w:after="20"/>
-        <w:ind w:left="283"/>
-      </w:pPr>
-      <w:r>
-        <w:rPr>
-          <w:rFonts w:ascii="Times New Roman" w:hAnsi="Times New Roman" w:eastAsia="游明朝"/>
-          <w:b w:val="0"/>
-          <w:sz w:val="21"/>
-        </w:rPr>
-        <w:t>マクロ金融ワークショップ（一橋大学）</w:t>
-      </w:r>
-    </w:p>
-    <w:p>
-      <w:pPr>
-        <w:spacing w:after="20"/>
-        <w:ind w:left="283"/>
-      </w:pPr>
-      <w:r>
-        <w:rPr>
-          <w:rFonts w:ascii="Times New Roman" w:hAnsi="Times New Roman" w:eastAsia="游明朝"/>
-          <w:b w:val="0"/>
-          <w:sz w:val="21"/>
-        </w:rPr>
-        <w:t>第1回マクロ税制セミナー（学習院大学）</w:t>
-      </w:r>
-    </w:p>
-    <w:p>
-      <w:pPr>
-        <w:spacing w:after="20"/>
-        <w:ind w:left="283"/>
-      </w:pPr>
-      <w:r>
-        <w:rPr>
-          <w:rFonts w:ascii="Times New Roman" w:hAnsi="Times New Roman" w:eastAsia="游明朝"/>
-          <w:b w:val="0"/>
-          <w:sz w:val="21"/>
-        </w:rPr>
-        <w:t>早稲田大学セミナー</w:t>
-      </w:r>
-    </w:p>
-    <w:p>
-      <w:pPr>
-        <w:spacing w:after="20"/>
-        <w:ind w:left="283"/>
-      </w:pPr>
-      <w:r>
-        <w:rPr>
-          <w:rFonts w:ascii="Times New Roman" w:hAnsi="Times New Roman" w:eastAsia="游明朝"/>
-          <w:b w:val="0"/>
-          <w:sz w:val="21"/>
-        </w:rPr>
-        <w:t>マクロ経済学ワークショップ（慶應大学）</w:t>
-      </w:r>
-    </w:p>
-    <w:p>
-      <w:pPr>
-        <w:spacing w:after="20"/>
-        <w:ind w:left="283"/>
-      </w:pPr>
-      <w:r>
-        <w:rPr>
-          <w:rFonts w:ascii="Times New Roman" w:hAnsi="Times New Roman" w:eastAsia="游明朝"/>
-          <w:b w:val="0"/>
-          <w:sz w:val="21"/>
-        </w:rPr>
-        <w:t>SED</w:t>
-      </w:r>
-    </w:p>
-    <w:p>
-      <w:pPr>
-        <w:spacing w:after="20"/>
-        <w:ind w:left="283"/>
-      </w:pPr>
-      <w:r>
-        <w:rPr>
-          <w:rFonts w:ascii="Times New Roman" w:hAnsi="Times New Roman" w:eastAsia="游明朝"/>
-          <w:b w:val="0"/>
-          <w:sz w:val="21"/>
-        </w:rPr>
-        <w:t>六甲フォーラム（神戸大学）</w:t>
-      </w:r>
-    </w:p>
-    <w:p>
-      <w:pPr>
-        <w:spacing w:after="20"/>
-        <w:ind w:left="283"/>
-      </w:pPr>
-      <w:r>
-        <w:rPr>
-          <w:rFonts w:ascii="Times New Roman" w:hAnsi="Times New Roman" w:eastAsia="游明朝"/>
-          <w:b w:val="0"/>
-          <w:sz w:val="21"/>
-        </w:rPr>
-        <w:t>GSE-OSIPP-ISER Joint Conference in Economics（大阪大学）</w:t>
-      </w:r>
-    </w:p>
-    <w:p>
-      <w:pPr>
-        <w:spacing w:after="20"/>
-        <w:ind w:left="283"/>
-      </w:pPr>
-      <w:r>
-        <w:rPr>
-          <w:rFonts w:ascii="Times New Roman" w:hAnsi="Times New Roman" w:eastAsia="游明朝"/>
-          <w:b w:val="0"/>
-          <w:sz w:val="21"/>
-        </w:rPr>
-        <w:t>7th Annual CIGS End of Year Macroeconomics Conference</w:t>
+        <w:t>マクロ経済学ワークショップ（一橋大学）, マクロ経済学ワークショップ 2021（東京大学 CIRJE）, マクロ金融ワークショップ（一橋大学）, 第1回マクロ税制セミナー（学習院大学）, 早稲田大学セミナー, マクロ経済学ワークショップ（慶應大学）, SED, 六甲フォーラム（神戸大学）, GSE-OSIPP-ISER Joint Conference in Economics（大阪大学）, 7th Annual CIGS End of Year Macroeconomics Conference</w:t>
       </w:r>
     </w:p>
     <w:p>
@@ -888,7 +622,7 @@
     </w:p>
     <w:p>
       <w:pPr>
-        <w:spacing w:after="20"/>
+        <w:spacing w:after="40"/>
         <w:ind w:left="283"/>
       </w:pPr>
       <w:r>
@@ -897,35 +631,7 @@
           <w:b w:val="0"/>
           <w:sz w:val="21"/>
         </w:rPr>
-        <w:t>東北大学現代経済学研究会</w:t>
-      </w:r>
-    </w:p>
-    <w:p>
-      <w:pPr>
-        <w:spacing w:after="20"/>
-        <w:ind w:left="283"/>
-      </w:pPr>
-      <w:r>
-        <w:rPr>
-          <w:rFonts w:ascii="Times New Roman" w:hAnsi="Times New Roman" w:eastAsia="游明朝"/>
-          <w:b w:val="0"/>
-          <w:sz w:val="21"/>
-        </w:rPr>
-        <w:t>経済成長と構造変化に関する長期分析研究会</w:t>
-      </w:r>
-    </w:p>
-    <w:p>
-      <w:pPr>
-        <w:spacing w:after="20"/>
-        <w:ind w:left="283"/>
-      </w:pPr>
-      <w:r>
-        <w:rPr>
-          <w:rFonts w:ascii="Times New Roman" w:hAnsi="Times New Roman" w:eastAsia="游明朝"/>
-          <w:b w:val="0"/>
-          <w:sz w:val="21"/>
-        </w:rPr>
-        <w:t>ISER Virtual Workshop in Macro/International Economics</w:t>
+        <w:t>東北大学現代経済学研究会, 経済成長と構造変化に関する長期分析研究会, ISER Virtual Workshop in Macro/International Economics</w:t>
       </w:r>
     </w:p>
     <w:p>
@@ -943,7 +649,7 @@
     </w:p>
     <w:p>
       <w:pPr>
-        <w:spacing w:after="20"/>
+        <w:spacing w:after="40"/>
         <w:ind w:left="283"/>
       </w:pPr>
       <w:r>
@@ -952,21 +658,7 @@
           <w:b w:val="0"/>
           <w:sz w:val="21"/>
         </w:rPr>
-        <w:t>CIGS Conference on Macroeconomic Theory and Policy 2019</w:t>
-      </w:r>
-    </w:p>
-    <w:p>
-      <w:pPr>
-        <w:spacing w:after="20"/>
-        <w:ind w:left="283"/>
-      </w:pPr>
-      <w:r>
-        <w:rPr>
-          <w:rFonts w:ascii="Times New Roman" w:hAnsi="Times New Roman" w:eastAsia="游明朝"/>
-          <w:b w:val="0"/>
-          <w:sz w:val="21"/>
-        </w:rPr>
-        <w:t>Monetary Policy Workshop</w:t>
+        <w:t>CIGS Conference on Macroeconomic Theory and Policy 2019, Monetary Policy Workshop</w:t>
       </w:r>
     </w:p>
     <w:sectPr>

</xml_diff>

<commit_message>
Add 研究の概要 section after 氏名 in cv_ja.docx
https://claude.ai/code/session_01BeaMThBdd5D4FWDMPcdYZd
</commit_message>
<xml_diff>
--- a/cv_ja/cv_ja.docx
+++ b/cv_ja/cv_ja.docx
@@ -65,6 +65,32 @@
           <w:sz w:val="21"/>
         </w:rPr>
         <w:t>所属部門：実証経済部門</w:t>
+      </w:r>
+    </w:p>
+    <w:p>
+      <w:pPr>
+        <w:spacing w:before="240" w:after="80"/>
+      </w:pPr>
+      <w:r>
+        <w:rPr>
+          <w:rFonts w:ascii="Times New Roman" w:hAnsi="Times New Roman" w:eastAsia="游ゴシック"/>
+          <w:b/>
+          <w:sz w:val="24"/>
+        </w:rPr>
+        <w:t>【研究の概要】</w:t>
+      </w:r>
+    </w:p>
+    <w:p>
+      <w:pPr>
+        <w:spacing w:after="40"/>
+      </w:pPr>
+      <w:r>
+        <w:rPr>
+          <w:rFonts w:ascii="Times New Roman" w:hAnsi="Times New Roman" w:eastAsia="游明朝"/>
+          <w:b w:val="0"/>
+          <w:sz w:val="21"/>
+        </w:rPr>
+        <w:t>マクロ経済学を専門とし、日本経済が直面する主要課題（財政赤字・低成長・少子高齢化）を中心に研究を行っている。インフレ期待の形成メカニズム、ゼロ金利制約下での金融政策、国際貿易における重力モデル、技術進歩の停滞、名目賃金の下方硬直性などを研究対象とし、理論・実証の両面からアプローチしている。</w:t>
       </w:r>
     </w:p>
     <w:p>

</xml_diff>

<commit_message>
Mark Robustly Optimal Voting Rule as forthcoming at JET
The paper moved from conditionally accepted / under revision to
forthcoming. Update the research page and both English and Japanese
CVs (LaTeX sources and the generated docx) accordingly, and standardize
the co-author name to Shinpei Noguchi.

https://claude.ai/code/session_01JQZF7PGKF4fT5XDubQuoL4
</commit_message>
<xml_diff>
--- a/cv_ja/cv_ja.docx
+++ b/cv_ja/cv_ja.docx
@@ -308,6 +308,39 @@
         <w:t xml:space="preserve">      with Nobuyuki Hanaki,</w:t>
         <w:br/>
         <w:t xml:space="preserve">      Forthcoming at Experimental Economics, 2025.</w:t>
+      </w:r>
+    </w:p>
+    <w:p>
+      <w:pPr>
+        <w:spacing w:after="60"/>
+        <w:ind w:left="283" w:hanging="283"/>
+      </w:pPr>
+      <w:r>
+        <w:rPr>
+          <w:rFonts w:ascii="Times New Roman" w:hAnsi="Times New Roman" w:eastAsia="游明朝"/>
+          <w:b w:val="0"/>
+          <w:sz w:val="21"/>
+        </w:rPr>
+        <w:t xml:space="preserve">[4]  </w:t>
+      </w:r>
+      <w:r>
+        <w:rPr>
+          <w:rFonts w:ascii="Times New Roman" w:hAnsi="Times New Roman" w:eastAsia="游明朝"/>
+          <w:b/>
+          <w:sz w:val="21"/>
+        </w:rPr>
+        <w:t>"Robustly Optimal Voting Rule,"</w:t>
+      </w:r>
+      <w:r>
+        <w:rPr>
+          <w:rFonts w:ascii="Times New Roman" w:hAnsi="Times New Roman" w:eastAsia="游明朝"/>
+          <w:b w:val="0"/>
+          <w:sz w:val="21"/>
+        </w:rPr>
+        <w:br/>
+        <w:t xml:space="preserve">      with Noriaki Kiguchi and Shinpei Noguchi,</w:t>
+        <w:br/>
+        <w:t xml:space="preserve">      Forthcoming at Journal of Economic Theory, 2025.</w:t>
       </w:r>
     </w:p>
     <w:p>

</xml_diff>

<commit_message>
Update forthcoming papers' expected year to 2026
Both 'An Experiment on a Multi-Period Beauty Contest Game' (Experimental
Economics) and 'Robustly Optimal Voting Rule' (Journal of Economic Theory)
are now expected to be published in 2026. Update the year in the research
page and both English and Japanese CVs (LaTeX sources and the generated docx).

https://claude.ai/code/session_01JQZF7PGKF4fT5XDubQuoL4
</commit_message>
<xml_diff>
--- a/cv_ja/cv_ja.docx
+++ b/cv_ja/cv_ja.docx
@@ -307,7 +307,7 @@
         <w:br/>
         <w:t xml:space="preserve">      with Nobuyuki Hanaki,</w:t>
         <w:br/>
-        <w:t xml:space="preserve">      Forthcoming at Experimental Economics, 2025.</w:t>
+        <w:t xml:space="preserve">      Forthcoming at Experimental Economics, 2026.</w:t>
       </w:r>
     </w:p>
     <w:p>
@@ -340,7 +340,7 @@
         <w:br/>
         <w:t xml:space="preserve">      with Noriaki Kiguchi and Shinpei Noguchi,</w:t>
         <w:br/>
-        <w:t xml:space="preserve">      Forthcoming at Journal of Economic Theory, 2025.</w:t>
+        <w:t xml:space="preserve">      Forthcoming at Journal of Economic Theory, 2026.</w:t>
       </w:r>
     </w:p>
     <w:p>

</xml_diff>